<commit_message>
Correccion de nombre convocante: Manuel Castillo Silva en nómina, documento Word y base de firmantes
</commit_message>
<xml_diff>
--- a/carta_fondecyt_2027.docx
+++ b/carta_fondecyt_2027.docx
@@ -1721,6 +1721,81 @@
           <w14:ligatures w14:val="none"/>
         </w:rPr>
         <w:t>Sabemos que lo que solicitamos no es simple y que puede generar legítimas tensiones respecto de quienes cumplieron estrictamente todas las exigencias formales. Sin embargo, apelamos al juicio de ustedes como pares evaluadores, precisamente porque ese juicio es aquello que la exigencia de idioma busca proteger. Si el defecto observado no afecta la evaluación académica de las propuestas, estimamos fundamental que quienes participan en dicha evaluación puedan pronunciarse fundadamente sobre sus efectos y sobre la proporcionalidad de declarar fuera de bases una postulación por esta causa.</w:t>
+      </w:r>
+    </w:p>
+    <w:p>
+      <w:pPr>
+        <w:spacing w:before="240" w:after="120"/>
+      </w:pPr>
+      <w:r>
+        <w:rPr>
+          <w:b/>
+        </w:rPr>
+        <w:t>Saludan atentamente,</w:t>
+      </w:r>
+    </w:p>
+    <w:p>
+      <w:r>
+        <w:rPr>
+          <w:b/>
+          <w:color w:val="1E3A8A"/>
+        </w:rPr>
+        <w:t>Investigadoras e investigadores convocantes:</w:t>
+      </w:r>
+    </w:p>
+    <w:p>
+      <w:r>
+        <w:rPr>
+          <w:b/>
+        </w:rPr>
+        <w:t>• Dr. Manuel Castillo Silva</w:t>
+      </w:r>
+      <w:r>
+        <w:t> — Universidad de Valparaíso (Regular 2027, Ciencias de la Tierra)</w:t>
+      </w:r>
+    </w:p>
+    <w:p>
+      <w:r>
+        <w:rPr>
+          <w:b/>
+        </w:rPr>
+        <w:t>• Dra. Angélica Escobar Maldonado</w:t>
+      </w:r>
+      <w:r>
+        <w:t> — Universidad de Valparaíso (Regular 2027, Biología 3, Folio 1272708)</w:t>
+      </w:r>
+    </w:p>
+    <w:p>
+      <w:r>
+        <w:rPr>
+          <w:b/>
+        </w:rPr>
+        <w:t>• Dr. Daniel Ramírez Ruiz</w:t>
+      </w:r>
+      <w:r>
+        <w:t> — Universidad de Valparaíso (Regular 2027, Ing 1, Folio 1271540)</w:t>
+      </w:r>
+    </w:p>
+    <w:p>
+      <w:r>
+        <w:rPr>
+          <w:b/>
+        </w:rPr>
+        <w:t>• Dr. Jonathan Martínez Pinto</w:t>
+      </w:r>
+      <w:r>
+        <w:t> — Universidad de Valparaíso (Regular 2027, Inter-Trans Disciplinario, Folio 1272745)</w:t>
+      </w:r>
+    </w:p>
+    <w:p>
+      <w:r>
+        <w:rPr>
+          <w:b/>
+        </w:rPr>
+        <w:t>• Dr. Evandro Ferrada Poblete</w:t>
+      </w:r>
+      <w:r>
+        <w:t> — Universidad de Valparaíso (Regular 2027, Biología 1, Folio 1271725)</w:t>
       </w:r>
     </w:p>
     <w:sectPr>

</xml_diff>

<commit_message>
Ajuste nombre: Manuel Castillo Silva como 4to firmante afectado en la tabla (folio 1271665) y removido de convocantes
</commit_message>
<xml_diff>
--- a/carta_fondecyt_2027.docx
+++ b/carta_fondecyt_2027.docx
@@ -1721,81 +1721,6 @@
           <w14:ligatures w14:val="none"/>
         </w:rPr>
         <w:t>Sabemos que lo que solicitamos no es simple y que puede generar legítimas tensiones respecto de quienes cumplieron estrictamente todas las exigencias formales. Sin embargo, apelamos al juicio de ustedes como pares evaluadores, precisamente porque ese juicio es aquello que la exigencia de idioma busca proteger. Si el defecto observado no afecta la evaluación académica de las propuestas, estimamos fundamental que quienes participan en dicha evaluación puedan pronunciarse fundadamente sobre sus efectos y sobre la proporcionalidad de declarar fuera de bases una postulación por esta causa.</w:t>
-      </w:r>
-    </w:p>
-    <w:p>
-      <w:pPr>
-        <w:spacing w:before="240" w:after="120"/>
-      </w:pPr>
-      <w:r>
-        <w:rPr>
-          <w:b/>
-        </w:rPr>
-        <w:t>Saludan atentamente,</w:t>
-      </w:r>
-    </w:p>
-    <w:p>
-      <w:r>
-        <w:rPr>
-          <w:b/>
-          <w:color w:val="1E3A8A"/>
-        </w:rPr>
-        <w:t>Investigadoras e investigadores convocantes:</w:t>
-      </w:r>
-    </w:p>
-    <w:p>
-      <w:r>
-        <w:rPr>
-          <w:b/>
-        </w:rPr>
-        <w:t>• Dr. Manuel Castillo Silva</w:t>
-      </w:r>
-      <w:r>
-        <w:t> — Universidad de Valparaíso (Regular 2027, Ciencias de la Tierra)</w:t>
-      </w:r>
-    </w:p>
-    <w:p>
-      <w:r>
-        <w:rPr>
-          <w:b/>
-        </w:rPr>
-        <w:t>• Dra. Angélica Escobar Maldonado</w:t>
-      </w:r>
-      <w:r>
-        <w:t> — Universidad de Valparaíso (Regular 2027, Biología 3, Folio 1272708)</w:t>
-      </w:r>
-    </w:p>
-    <w:p>
-      <w:r>
-        <w:rPr>
-          <w:b/>
-        </w:rPr>
-        <w:t>• Dr. Daniel Ramírez Ruiz</w:t>
-      </w:r>
-      <w:r>
-        <w:t> — Universidad de Valparaíso (Regular 2027, Ing 1, Folio 1271540)</w:t>
-      </w:r>
-    </w:p>
-    <w:p>
-      <w:r>
-        <w:rPr>
-          <w:b/>
-        </w:rPr>
-        <w:t>• Dr. Jonathan Martínez Pinto</w:t>
-      </w:r>
-      <w:r>
-        <w:t> — Universidad de Valparaíso (Regular 2027, Inter-Trans Disciplinario, Folio 1272745)</w:t>
-      </w:r>
-    </w:p>
-    <w:p>
-      <w:r>
-        <w:rPr>
-          <w:b/>
-        </w:rPr>
-        <w:t>• Dr. Evandro Ferrada Poblete</w:t>
-      </w:r>
-      <w:r>
-        <w:t> — Universidad de Valparaíso (Regular 2027, Biología 1, Folio 1271725)</w:t>
       </w:r>
     </w:p>
     <w:sectPr>

</xml_diff>